<commit_message>
TEST - apply member filter from URL2
</commit_message>
<xml_diff>
--- a/Cambios de valores/Doc1.docx
+++ b/Cambios de valores/Doc1.docx
@@ -69,7 +69,7 @@
           </mc:Choice>
           <mc:Fallback>
             <w:pict>
-              <v:shapetype w14:anchorId="4B90F8CF" id="_x0000_t32" coordsize="21600,21600" o:spt="32" o:oned="t" path="m,l21600,21600e" filled="f">
+              <v:shapetype w14:anchorId="355413BD" id="_x0000_t32" coordsize="21600,21600" o:spt="32" o:oned="t" path="m,l21600,21600e" filled="f">
                 <v:path arrowok="t" fillok="f" o:connecttype="none"/>
                 <o:lock v:ext="edit" shapetype="t"/>
               </v:shapetype>
@@ -382,7 +382,7 @@
           </mc:Choice>
           <mc:Fallback>
             <w:pict>
-              <v:shape w14:anchorId="600EBC4A" id="Straight Arrow Connector 30" o:spid="_x0000_s1026" type="#_x0000_t32" style="position:absolute;margin-left:128.6pt;margin-top:92.95pt;width:52.2pt;height:133.5pt;flip:x y;z-index:251698176;visibility:visible;mso-wrap-style:square;mso-width-percent:0;mso-height-percent:0;mso-wrap-distance-left:9pt;mso-wrap-distance-top:0;mso-wrap-distance-right:9pt;mso-wrap-distance-bottom:0;mso-position-horizontal:absolute;mso-position-horizontal-relative:text;mso-position-vertical:absolute;mso-position-vertical-relative:text;mso-width-percent:0;mso-height-percent:0;mso-width-relative:margin;mso-height-relative:margin" o:gfxdata="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" strokecolor="#ffc000 [3207]" strokeweight="1.5pt">
+              <v:shape w14:anchorId="5D28FFA8" id="Straight Arrow Connector 30" o:spid="_x0000_s1026" type="#_x0000_t32" style="position:absolute;margin-left:128.6pt;margin-top:92.95pt;width:52.2pt;height:133.5pt;flip:x y;z-index:251698176;visibility:visible;mso-wrap-style:square;mso-width-percent:0;mso-height-percent:0;mso-wrap-distance-left:9pt;mso-wrap-distance-top:0;mso-wrap-distance-right:9pt;mso-wrap-distance-bottom:0;mso-position-horizontal:absolute;mso-position-horizontal-relative:text;mso-position-vertical:absolute;mso-position-vertical-relative:text;mso-width-percent:0;mso-height-percent:0;mso-width-relative:margin;mso-height-relative:margin" o:gfxdata="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" strokecolor="#ffc000 [3207]" strokeweight="1.5pt">
                 <v:stroke endarrow="block" joinstyle="miter"/>
               </v:shape>
             </w:pict>
@@ -454,7 +454,7 @@
           </mc:Choice>
           <mc:Fallback>
             <w:pict>
-              <v:shape w14:anchorId="095F6827" id="Straight Arrow Connector 14" o:spid="_x0000_s1026" type="#_x0000_t32" style="position:absolute;margin-left:84.25pt;margin-top:77.1pt;width:36.8pt;height:55pt;flip:x;z-index:251673600;visibility:visible;mso-wrap-style:square;mso-width-percent:0;mso-height-percent:0;mso-wrap-distance-left:9pt;mso-wrap-distance-top:0;mso-wrap-distance-right:9pt;mso-wrap-distance-bottom:0;mso-position-horizontal:absolute;mso-position-horizontal-relative:text;mso-position-vertical:absolute;mso-position-vertical-relative:text;mso-width-percent:0;mso-height-percent:0;mso-width-relative:margin;mso-height-relative:margin" o:gfxdata="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" strokecolor="#4472c4 [3204]" strokeweight="1.5pt">
+              <v:shape w14:anchorId="29B5EA5F" id="Straight Arrow Connector 14" o:spid="_x0000_s1026" type="#_x0000_t32" style="position:absolute;margin-left:84.25pt;margin-top:77.1pt;width:36.8pt;height:55pt;flip:x;z-index:251673600;visibility:visible;mso-wrap-style:square;mso-width-percent:0;mso-height-percent:0;mso-wrap-distance-left:9pt;mso-wrap-distance-top:0;mso-wrap-distance-right:9pt;mso-wrap-distance-bottom:0;mso-position-horizontal:absolute;mso-position-horizontal-relative:text;mso-position-vertical:absolute;mso-position-vertical-relative:text;mso-width-percent:0;mso-height-percent:0;mso-width-relative:margin;mso-height-relative:margin" o:gfxdata="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" strokecolor="#4472c4 [3204]" strokeweight="1.5pt">
                 <v:stroke endarrow="block" joinstyle="miter"/>
               </v:shape>
             </w:pict>
@@ -777,7 +777,7 @@
           </mc:Choice>
           <mc:Fallback>
             <w:pict>
-              <v:line w14:anchorId="00EC5093" id="Straight Connector 9" o:spid="_x0000_s1026" style="position:absolute;flip:y;z-index:251664384;visibility:visible;mso-wrap-style:square;mso-width-percent:0;mso-height-percent:0;mso-wrap-distance-left:9pt;mso-wrap-distance-top:0;mso-wrap-distance-right:9pt;mso-wrap-distance-bottom:0;mso-position-horizontal:absolute;mso-position-horizontal-relative:text;mso-position-vertical:absolute;mso-position-vertical-relative:text;mso-width-percent:0;mso-height-percent:0;mso-width-relative:margin;mso-height-relative:margin" from="42.85pt,93.8pt" to="73.3pt,100.15pt" o:gfxdata="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" strokecolor="#4472c4 [3204]" strokeweight=".5pt">
+              <v:line w14:anchorId="74F4191A" id="Straight Connector 9" o:spid="_x0000_s1026" style="position:absolute;flip:y;z-index:251664384;visibility:visible;mso-wrap-style:square;mso-width-percent:0;mso-height-percent:0;mso-wrap-distance-left:9pt;mso-wrap-distance-top:0;mso-wrap-distance-right:9pt;mso-wrap-distance-bottom:0;mso-position-horizontal:absolute;mso-position-horizontal-relative:text;mso-position-vertical:absolute;mso-position-vertical-relative:text;mso-width-percent:0;mso-height-percent:0;mso-width-relative:margin;mso-height-relative:margin" from="42.85pt,93.8pt" to="73.3pt,100.15pt" o:gfxdata="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" strokecolor="#4472c4 [3204]" strokeweight=".5pt">
                 <v:stroke joinstyle="miter"/>
               </v:line>
             </w:pict>
@@ -846,7 +846,7 @@
           </mc:Choice>
           <mc:Fallback>
             <w:pict>
-              <v:line w14:anchorId="023A632A" id="Straight Connector 8" o:spid="_x0000_s1026" style="position:absolute;flip:y;z-index:251662336;visibility:visible;mso-wrap-style:square;mso-width-percent:0;mso-height-percent:0;mso-wrap-distance-left:9pt;mso-wrap-distance-top:0;mso-wrap-distance-right:9pt;mso-wrap-distance-bottom:0;mso-position-horizontal:absolute;mso-position-horizontal-relative:text;mso-position-vertical:absolute;mso-position-vertical-relative:text;mso-width-percent:0;mso-height-percent:0;mso-width-relative:margin;mso-height-relative:margin" from="101.3pt,73.5pt" to="131.75pt,79.85pt" o:gfxdata="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" strokecolor="#4472c4 [3204]" strokeweight=".5pt">
+              <v:line w14:anchorId="3C81A93B" id="Straight Connector 8" o:spid="_x0000_s1026" style="position:absolute;flip:y;z-index:251662336;visibility:visible;mso-wrap-style:square;mso-width-percent:0;mso-height-percent:0;mso-wrap-distance-left:9pt;mso-wrap-distance-top:0;mso-wrap-distance-right:9pt;mso-wrap-distance-bottom:0;mso-position-horizontal:absolute;mso-position-horizontal-relative:text;mso-position-vertical:absolute;mso-position-vertical-relative:text;mso-width-percent:0;mso-height-percent:0;mso-width-relative:margin;mso-height-relative:margin" from="101.3pt,73.5pt" to="131.75pt,79.85pt" o:gfxdata="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" strokecolor="#4472c4 [3204]" strokeweight=".5pt">
                 <v:stroke joinstyle="miter"/>
               </v:line>
             </w:pict>
@@ -909,7 +909,7 @@
           </mc:Choice>
           <mc:Fallback>
             <w:pict>
-              <v:line w14:anchorId="69A72B02" id="Straight Connector 7" o:spid="_x0000_s1026" style="position:absolute;z-index:251660288;visibility:visible;mso-wrap-style:square;mso-wrap-distance-left:9pt;mso-wrap-distance-top:0;mso-wrap-distance-right:9pt;mso-wrap-distance-bottom:0;mso-position-horizontal:absolute;mso-position-horizontal-relative:text;mso-position-vertical:absolute;mso-position-vertical-relative:text" from="102.45pt,92.55pt" to="131.7pt,92.55pt" o:gfxdata="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" strokecolor="#4472c4 [3204]" strokeweight=".5pt">
+              <v:line w14:anchorId="4C7A3CFD" id="Straight Connector 7" o:spid="_x0000_s1026" style="position:absolute;z-index:251660288;visibility:visible;mso-wrap-style:square;mso-wrap-distance-left:9pt;mso-wrap-distance-top:0;mso-wrap-distance-right:9pt;mso-wrap-distance-bottom:0;mso-position-horizontal:absolute;mso-position-horizontal-relative:text;mso-position-vertical:absolute;mso-position-vertical-relative:text" from="102.45pt,92.55pt" to="131.7pt,92.55pt" o:gfxdata="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" strokecolor="#4472c4 [3204]" strokeweight=".5pt">
                 <v:stroke joinstyle="miter"/>
               </v:line>
             </w:pict>
@@ -968,6 +968,11 @@
       </w:r>
     </w:p>
     <w:p>
+      <w:pPr>
+        <w:rPr>
+          <w:lang w:val="en-US"/>
+        </w:rPr>
+      </w:pPr>
       <w:r>
         <w:rPr>
           <w:noProof/>
@@ -1034,7 +1039,7 @@
           </mc:Choice>
           <mc:Fallback>
             <w:pict>
-              <v:shape w14:anchorId="368662E0" id="Straight Arrow Connector 36" o:spid="_x0000_s1026" type="#_x0000_t32" style="position:absolute;margin-left:258.9pt;margin-top:89.6pt;width:10.45pt;height:263.1pt;flip:x;z-index:251707392;visibility:visible;mso-wrap-style:square;mso-width-percent:0;mso-height-percent:0;mso-wrap-distance-left:9pt;mso-wrap-distance-top:0;mso-wrap-distance-right:9pt;mso-wrap-distance-bottom:0;mso-position-horizontal:absolute;mso-position-horizontal-relative:text;mso-position-vertical:absolute;mso-position-vertical-relative:text;mso-width-percent:0;mso-height-percent:0;mso-width-relative:margin;mso-height-relative:margin" o:gfxdata="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" strokecolor="#ed7d31 [3205]" strokeweight="1.5pt">
+              <v:shape w14:anchorId="4728362C" id="Straight Arrow Connector 36" o:spid="_x0000_s1026" type="#_x0000_t32" style="position:absolute;margin-left:258.9pt;margin-top:89.6pt;width:10.45pt;height:263.1pt;flip:x;z-index:251707392;visibility:visible;mso-wrap-style:square;mso-width-percent:0;mso-height-percent:0;mso-wrap-distance-left:9pt;mso-wrap-distance-top:0;mso-wrap-distance-right:9pt;mso-wrap-distance-bottom:0;mso-position-horizontal:absolute;mso-position-horizontal-relative:text;mso-position-vertical:absolute;mso-position-vertical-relative:text;mso-width-percent:0;mso-height-percent:0;mso-width-relative:margin;mso-height-relative:margin" o:gfxdata="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" strokecolor="#ed7d31 [3205]" strokeweight="1.5pt">
                 <v:stroke startarrow="block" endarrow="block" joinstyle="miter"/>
               </v:shape>
             </w:pict>
@@ -1107,7 +1112,7 @@
           </mc:Choice>
           <mc:Fallback>
             <w:pict>
-              <v:shape w14:anchorId="127BD430" id="Straight Arrow Connector 31" o:spid="_x0000_s1026" type="#_x0000_t32" style="position:absolute;margin-left:192.2pt;margin-top:95.25pt;width:34.55pt;height:130.7pt;flip:x;z-index:251699200;visibility:visible;mso-wrap-style:square;mso-width-percent:0;mso-height-percent:0;mso-wrap-distance-left:9pt;mso-wrap-distance-top:0;mso-wrap-distance-right:9pt;mso-wrap-distance-bottom:0;mso-position-horizontal:absolute;mso-position-horizontal-relative:text;mso-position-vertical:absolute;mso-position-vertical-relative:text;mso-width-percent:0;mso-height-percent:0;mso-width-relative:margin;mso-height-relative:margin" o:gfxdata="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" strokecolor="#ed7d31 [3205]" strokeweight="1.5pt">
+              <v:shape w14:anchorId="27AC5312" id="Straight Arrow Connector 31" o:spid="_x0000_s1026" type="#_x0000_t32" style="position:absolute;margin-left:192.2pt;margin-top:95.25pt;width:34.55pt;height:130.7pt;flip:x;z-index:251699200;visibility:visible;mso-wrap-style:square;mso-width-percent:0;mso-height-percent:0;mso-wrap-distance-left:9pt;mso-wrap-distance-top:0;mso-wrap-distance-right:9pt;mso-wrap-distance-bottom:0;mso-position-horizontal:absolute;mso-position-horizontal-relative:text;mso-position-vertical:absolute;mso-position-vertical-relative:text;mso-width-percent:0;mso-height-percent:0;mso-width-relative:margin;mso-height-relative:margin" o:gfxdata="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" strokecolor="#ed7d31 [3205]" strokeweight="1.5pt">
                 <v:stroke startarrow="block" endarrow="block" joinstyle="miter"/>
               </v:shape>
             </w:pict>
@@ -1180,7 +1185,7 @@
           </mc:Choice>
           <mc:Fallback>
             <w:pict>
-              <v:shape w14:anchorId="37B08115" id="Straight Arrow Connector 33" o:spid="_x0000_s1026" type="#_x0000_t32" style="position:absolute;margin-left:222.55pt;margin-top:89.6pt;width:47.65pt;height:261.25pt;flip:x;z-index:251701248;visibility:visible;mso-wrap-style:square;mso-width-percent:0;mso-height-percent:0;mso-wrap-distance-left:9pt;mso-wrap-distance-top:0;mso-wrap-distance-right:9pt;mso-wrap-distance-bottom:0;mso-position-horizontal:absolute;mso-position-horizontal-relative:text;mso-position-vertical:absolute;mso-position-vertical-relative:text;mso-width-percent:0;mso-height-percent:0;mso-width-relative:margin;mso-height-relative:margin" o:gfxdata="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" strokecolor="#ed7d31 [3205]" strokeweight="1.5pt">
+              <v:shape w14:anchorId="2FEE4699" id="Straight Arrow Connector 33" o:spid="_x0000_s1026" type="#_x0000_t32" style="position:absolute;margin-left:222.55pt;margin-top:89.6pt;width:47.65pt;height:261.25pt;flip:x;z-index:251701248;visibility:visible;mso-wrap-style:square;mso-width-percent:0;mso-height-percent:0;mso-wrap-distance-left:9pt;mso-wrap-distance-top:0;mso-wrap-distance-right:9pt;mso-wrap-distance-bottom:0;mso-position-horizontal:absolute;mso-position-horizontal-relative:text;mso-position-vertical:absolute;mso-position-vertical-relative:text;mso-width-percent:0;mso-height-percent:0;mso-width-relative:margin;mso-height-relative:margin" o:gfxdata="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" strokecolor="#ed7d31 [3205]" strokeweight="1.5pt">
                 <v:stroke startarrow="block" endarrow="block" joinstyle="miter"/>
               </v:shape>
             </w:pict>
@@ -1459,7 +1464,7 @@
           </mc:Choice>
           <mc:Fallback>
             <w:pict>
-              <v:line w14:anchorId="6695E18A" id="Straight Connector 11" o:spid="_x0000_s1026" style="position:absolute;flip:y;z-index:251668480;visibility:visible;mso-wrap-style:square;mso-width-percent:0;mso-height-percent:0;mso-wrap-distance-left:9pt;mso-wrap-distance-top:0;mso-wrap-distance-right:9pt;mso-wrap-distance-bottom:0;mso-position-horizontal:absolute;mso-position-horizontal-relative:text;mso-position-vertical:absolute;mso-position-vertical-relative:text;mso-width-percent:0;mso-height-percent:0;mso-width-relative:margin;mso-height-relative:margin" from="211.75pt,76.9pt" to="242.2pt,83.25pt" o:gfxdata="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" strokecolor="#4472c4 [3204]" strokeweight=".5pt">
+              <v:line w14:anchorId="7C373B1F" id="Straight Connector 11" o:spid="_x0000_s1026" style="position:absolute;flip:y;z-index:251668480;visibility:visible;mso-wrap-style:square;mso-width-percent:0;mso-height-percent:0;mso-wrap-distance-left:9pt;mso-wrap-distance-top:0;mso-wrap-distance-right:9pt;mso-wrap-distance-bottom:0;mso-position-horizontal:absolute;mso-position-horizontal-relative:text;mso-position-vertical:absolute;mso-position-vertical-relative:text;mso-width-percent:0;mso-height-percent:0;mso-width-relative:margin;mso-height-relative:margin" from="211.75pt,76.9pt" to="242.2pt,83.25pt" o:gfxdata="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" strokecolor="#4472c4 [3204]" strokeweight=".5pt">
                 <v:stroke joinstyle="miter"/>
               </v:line>
             </w:pict>
@@ -1531,7 +1536,7 @@
           </mc:Choice>
           <mc:Fallback>
             <w:pict>
-              <v:shape w14:anchorId="247B2DC1" id="Straight Arrow Connector 15" o:spid="_x0000_s1026" type="#_x0000_t32" style="position:absolute;margin-left:74.2pt;margin-top:83.8pt;width:149.55pt;height:56.1pt;flip:x;z-index:251675648;visibility:visible;mso-wrap-style:square;mso-width-percent:0;mso-height-percent:0;mso-wrap-distance-left:9pt;mso-wrap-distance-top:0;mso-wrap-distance-right:9pt;mso-wrap-distance-bottom:0;mso-position-horizontal:absolute;mso-position-horizontal-relative:margin;mso-position-vertical:absolute;mso-position-vertical-relative:text;mso-width-percent:0;mso-height-percent:0;mso-width-relative:margin;mso-height-relative:margin" o:gfxdata="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" strokecolor="#4472c4 [3204]" strokeweight="1.5pt">
+              <v:shape w14:anchorId="025305E8" id="Straight Arrow Connector 15" o:spid="_x0000_s1026" type="#_x0000_t32" style="position:absolute;margin-left:74.2pt;margin-top:83.8pt;width:149.55pt;height:56.1pt;flip:x;z-index:251675648;visibility:visible;mso-wrap-style:square;mso-width-percent:0;mso-height-percent:0;mso-wrap-distance-left:9pt;mso-wrap-distance-top:0;mso-wrap-distance-right:9pt;mso-wrap-distance-bottom:0;mso-position-horizontal:absolute;mso-position-horizontal-relative:margin;mso-position-vertical:absolute;mso-position-vertical-relative:text;mso-width-percent:0;mso-height-percent:0;mso-width-relative:margin;mso-height-relative:margin" o:gfxdata="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" strokecolor="#4472c4 [3204]" strokeweight="1.5pt">
                 <v:stroke endarrow="block" joinstyle="miter"/>
                 <w10:wrap anchorx="margin"/>
               </v:shape>
@@ -1762,7 +1767,7 @@
       </w:r>
       <w:r>
         <w:drawing>
-          <wp:inline distT="0" distB="0" distL="0" distR="0" wp14:anchorId="3D98FB4F" wp14:editId="7FD068E7">
+          <wp:inline distT="0" distB="0" distL="0" distR="0" wp14:anchorId="3D98FB4F" wp14:editId="23410B76">
             <wp:extent cx="3898900" cy="1365349"/>
             <wp:effectExtent l="38100" t="38100" r="120650" b="120650"/>
             <wp:docPr id="2" name="Picture 2"/>
@@ -1878,7 +1883,7 @@
           </mc:Choice>
           <mc:Fallback>
             <w:pict>
-              <v:shape w14:anchorId="1048384F" id="Straight Arrow Connector 34" o:spid="_x0000_s1026" type="#_x0000_t32" style="position:absolute;margin-left:188.45pt;margin-top:87.25pt;width:84.5pt;height:135.7pt;flip:x;z-index:251703296;visibility:visible;mso-wrap-style:square;mso-width-percent:0;mso-height-percent:0;mso-wrap-distance-left:9pt;mso-wrap-distance-top:0;mso-wrap-distance-right:9pt;mso-wrap-distance-bottom:0;mso-position-horizontal:absolute;mso-position-horizontal-relative:margin;mso-position-vertical:absolute;mso-position-vertical-relative:text;mso-width-percent:0;mso-height-percent:0;mso-width-relative:margin;mso-height-relative:margin" o:gfxdata="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" strokecolor="#ed7d31 [3205]" strokeweight="1.5pt">
+              <v:shape w14:anchorId="47BDA639" id="Straight Arrow Connector 34" o:spid="_x0000_s1026" type="#_x0000_t32" style="position:absolute;margin-left:188.45pt;margin-top:87.25pt;width:84.5pt;height:135.7pt;flip:x;z-index:251703296;visibility:visible;mso-wrap-style:square;mso-width-percent:0;mso-height-percent:0;mso-wrap-distance-left:9pt;mso-wrap-distance-top:0;mso-wrap-distance-right:9pt;mso-wrap-distance-bottom:0;mso-position-horizontal:absolute;mso-position-horizontal-relative:margin;mso-position-vertical:absolute;mso-position-vertical-relative:text;mso-width-percent:0;mso-height-percent:0;mso-width-relative:margin;mso-height-relative:margin" o:gfxdata="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" strokecolor="#ed7d31 [3205]" strokeweight="1.5pt">
                 <v:stroke startarrow="block" endarrow="block" joinstyle="miter"/>
                 <w10:wrap anchorx="margin"/>
               </v:shape>
@@ -2053,7 +2058,7 @@
           </mc:Choice>
           <mc:Fallback>
             <w:pict>
-              <v:line w14:anchorId="7D5D7A79" id="Straight Connector 19" o:spid="_x0000_s1026" style="position:absolute;flip:y;z-index:251681792;visibility:visible;mso-wrap-style:square;mso-width-percent:0;mso-height-percent:0;mso-wrap-distance-left:9pt;mso-wrap-distance-top:0;mso-wrap-distance-right:9pt;mso-wrap-distance-bottom:0;mso-position-horizontal:absolute;mso-position-horizontal-relative:text;mso-position-vertical:absolute;mso-position-vertical-relative:text;mso-width-percent:0;mso-height-percent:0;mso-width-relative:margin;mso-height-relative:margin" from="250.1pt,78.6pt" to="280.55pt,84.95pt" o:gfxdata="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" strokecolor="#4472c4 [3204]" strokeweight=".5pt">
+              <v:line w14:anchorId="6F911D58" id="Straight Connector 19" o:spid="_x0000_s1026" style="position:absolute;flip:y;z-index:251681792;visibility:visible;mso-wrap-style:square;mso-width-percent:0;mso-height-percent:0;mso-wrap-distance-left:9pt;mso-wrap-distance-top:0;mso-wrap-distance-right:9pt;mso-wrap-distance-bottom:0;mso-position-horizontal:absolute;mso-position-horizontal-relative:text;mso-position-vertical:absolute;mso-position-vertical-relative:text;mso-width-percent:0;mso-height-percent:0;mso-width-relative:margin;mso-height-relative:margin" from="250.1pt,78.6pt" to="280.55pt,84.95pt" o:gfxdata="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" strokecolor="#4472c4 [3204]" strokeweight=".5pt">
                 <v:stroke joinstyle="miter"/>
               </v:line>
             </w:pict>
@@ -2125,7 +2130,7 @@
           </mc:Choice>
           <mc:Fallback>
             <w:pict>
-              <v:shape w14:anchorId="29EABF99" id="Straight Arrow Connector 17" o:spid="_x0000_s1026" type="#_x0000_t32" style="position:absolute;margin-left:75.75pt;margin-top:88.4pt;width:189.75pt;height:54.15pt;flip:x;z-index:251677696;visibility:visible;mso-wrap-style:square;mso-width-percent:0;mso-height-percent:0;mso-wrap-distance-left:9pt;mso-wrap-distance-top:0;mso-wrap-distance-right:9pt;mso-wrap-distance-bottom:0;mso-position-horizontal:absolute;mso-position-horizontal-relative:margin;mso-position-vertical:absolute;mso-position-vertical-relative:text;mso-width-percent:0;mso-height-percent:0;mso-width-relative:margin;mso-height-relative:margin" o:gfxdata="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" strokecolor="#4472c4 [3204]" strokeweight="1.5pt">
+              <v:shape w14:anchorId="13083EE6" id="Straight Arrow Connector 17" o:spid="_x0000_s1026" type="#_x0000_t32" style="position:absolute;margin-left:75.75pt;margin-top:88.4pt;width:189.75pt;height:54.15pt;flip:x;z-index:251677696;visibility:visible;mso-wrap-style:square;mso-width-percent:0;mso-height-percent:0;mso-wrap-distance-left:9pt;mso-wrap-distance-top:0;mso-wrap-distance-right:9pt;mso-wrap-distance-bottom:0;mso-position-horizontal:absolute;mso-position-horizontal-relative:margin;mso-position-vertical:absolute;mso-position-vertical-relative:text;mso-width-percent:0;mso-height-percent:0;mso-width-relative:margin;mso-height-relative:margin" o:gfxdata="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" strokecolor="#4472c4 [3204]" strokeweight="1.5pt">
                 <v:stroke endarrow="block" joinstyle="miter"/>
                 <w10:wrap anchorx="margin"/>
               </v:shape>
@@ -2240,7 +2245,7 @@
       </w:r>
       <w:r>
         <w:drawing>
-          <wp:inline distT="0" distB="0" distL="0" distR="0" wp14:anchorId="712A692C" wp14:editId="52A8DCD5">
+          <wp:inline distT="0" distB="0" distL="0" distR="0" wp14:anchorId="712A692C" wp14:editId="790FC16A">
             <wp:extent cx="3944945" cy="1389359"/>
             <wp:effectExtent l="38100" t="38100" r="113030" b="116205"/>
             <wp:docPr id="16" name="Picture 16"/>
@@ -2355,7 +2360,7 @@
           </mc:Choice>
           <mc:Fallback>
             <w:pict>
-              <v:shape w14:anchorId="2C33CE39" id="Straight Arrow Connector 38" o:spid="_x0000_s1026" type="#_x0000_t32" style="position:absolute;margin-left:60.5pt;margin-top:28.85pt;width:196.95pt;height:201.25pt;flip:x y;z-index:251709440;visibility:visible;mso-wrap-style:square;mso-width-percent:0;mso-height-percent:0;mso-wrap-distance-left:9pt;mso-wrap-distance-top:0;mso-wrap-distance-right:9pt;mso-wrap-distance-bottom:0;mso-position-horizontal:absolute;mso-position-horizontal-relative:margin;mso-position-vertical:absolute;mso-position-vertical-relative:text;mso-width-percent:0;mso-height-percent:0;mso-width-relative:margin;mso-height-relative:margin" o:gfxdata="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" strokecolor="#4472c4 [3204]" strokeweight="1.5pt">
+              <v:shape w14:anchorId="3B841076" id="Straight Arrow Connector 38" o:spid="_x0000_s1026" type="#_x0000_t32" style="position:absolute;margin-left:60.5pt;margin-top:28.85pt;width:196.95pt;height:201.25pt;flip:x y;z-index:251709440;visibility:visible;mso-wrap-style:square;mso-width-percent:0;mso-height-percent:0;mso-wrap-distance-left:9pt;mso-wrap-distance-top:0;mso-wrap-distance-right:9pt;mso-wrap-distance-bottom:0;mso-position-horizontal:absolute;mso-position-horizontal-relative:margin;mso-position-vertical:absolute;mso-position-vertical-relative:text;mso-width-percent:0;mso-height-percent:0;mso-width-relative:margin;mso-height-relative:margin" o:gfxdata="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" strokecolor="#4472c4 [3204]" strokeweight="1.5pt">
                 <v:stroke endarrow="block" joinstyle="miter"/>
                 <w10:wrap anchorx="margin"/>
               </v:shape>
@@ -2365,7 +2370,7 @@
       </w:r>
       <w:r>
         <w:drawing>
-          <wp:inline distT="0" distB="0" distL="0" distR="0" wp14:anchorId="172E3711" wp14:editId="1609BFFF">
+          <wp:inline distT="0" distB="0" distL="0" distR="0" wp14:anchorId="172E3711" wp14:editId="3FF2F148">
             <wp:extent cx="3876675" cy="1353007"/>
             <wp:effectExtent l="38100" t="38100" r="104775" b="114300"/>
             <wp:docPr id="4" name="Picture 4"/>
@@ -2380,7 +2385,15 @@
                     <pic:cNvPicPr/>
                   </pic:nvPicPr>
                   <pic:blipFill>
-                    <a:blip r:embed="rId7"/>
+                    <a:blip r:embed="rId7">
+                      <a:duotone>
+                        <a:prstClr val="black"/>
+                        <a:schemeClr val="accent4">
+                          <a:tint val="45000"/>
+                          <a:satMod val="400000"/>
+                        </a:schemeClr>
+                      </a:duotone>
+                    </a:blip>
                     <a:stretch>
                       <a:fillRect/>
                     </a:stretch>
@@ -2417,7 +2430,7 @@
     <w:p>
       <w:r>
         <w:drawing>
-          <wp:inline distT="0" distB="0" distL="0" distR="0" wp14:anchorId="7DF95829" wp14:editId="1FA59916">
+          <wp:inline distT="0" distB="0" distL="0" distR="0" wp14:anchorId="7DF95829" wp14:editId="655D1B73">
             <wp:extent cx="3862425" cy="1352121"/>
             <wp:effectExtent l="38100" t="38100" r="119380" b="114935"/>
             <wp:docPr id="5" name="Picture 5"/>
@@ -2432,7 +2445,15 @@
                     <pic:cNvPicPr/>
                   </pic:nvPicPr>
                   <pic:blipFill>
-                    <a:blip r:embed="rId8"/>
+                    <a:blip r:embed="rId8">
+                      <a:duotone>
+                        <a:prstClr val="black"/>
+                        <a:schemeClr val="accent4">
+                          <a:tint val="45000"/>
+                          <a:satMod val="400000"/>
+                        </a:schemeClr>
+                      </a:duotone>
+                    </a:blip>
                     <a:stretch>
                       <a:fillRect/>
                     </a:stretch>

</xml_diff>